<commit_message>
update the looks of the porfolio
</commit_message>
<xml_diff>
--- a/CV/CV Maikel Boezer - AI.docx
+++ b/CV/CV Maikel Boezer - AI.docx
@@ -1,6 +1,6 @@
 
 <file path=word/document.xml><?xml version="1.0" encoding="utf-8"?>
-<w:document xmlns:wpc="http://schemas.microsoft.com/office/word/2010/wordprocessingCanvas" xmlns:cx="http://schemas.microsoft.com/office/drawing/2014/chartex" xmlns:cx1="http://schemas.microsoft.com/office/drawing/2015/9/8/chartex" xmlns:cx2="http://schemas.microsoft.com/office/drawing/2015/10/21/chartex" xmlns:cx3="http://schemas.microsoft.com/office/drawing/2016/5/9/chartex" xmlns:cx4="http://schemas.microsoft.com/office/drawing/2016/5/10/chartex" xmlns:cx5="http://schemas.microsoft.com/office/drawing/2016/5/11/chartex" xmlns:cx6="http://schemas.microsoft.com/office/drawing/2016/5/12/chartex" xmlns:cx7="http://schemas.microsoft.com/office/drawing/2016/5/13/chartex" xmlns:cx8="http://schemas.microsoft.com/office/drawing/2016/5/14/chartex" xmlns:mc="http://schemas.openxmlformats.org/markup-compatibility/2006" xmlns:aink="http://schemas.microsoft.com/office/drawing/2016/ink" xmlns:am3d="http://schemas.microsoft.com/office/drawing/2017/model3d" xmlns:o="urn:schemas-microsoft-com:office:office" xmlns:oel="http://schemas.microsoft.com/office/2019/extlst" xmlns:r="http://schemas.openxmlformats.org/officeDocument/2006/relationships" xmlns:m="http://schemas.openxmlformats.org/officeDocument/2006/math" xmlns:v="urn:schemas-microsoft-com:vml" xmlns:wp14="http://schemas.microsoft.com/office/word/2010/wordprocessingDrawing" xmlns:wp="http://schemas.openxmlformats.org/drawingml/2006/wordprocessingDrawing" xmlns:w10="urn:schemas-microsoft-com:office:word" xmlns:w="http://schemas.openxmlformats.org/wordprocessingml/2006/main" xmlns:w14="http://schemas.microsoft.com/office/word/2010/wordml" xmlns:w15="http://schemas.microsoft.com/office/word/2012/wordml" xmlns:w16cex="http://schemas.microsoft.com/office/word/2018/wordml/cex" xmlns:w16cid="http://schemas.microsoft.com/office/word/2016/wordml/cid" xmlns:w16="http://schemas.microsoft.com/office/word/2018/wordml" xmlns:w16du="http://schemas.microsoft.com/office/word/2023/wordml/word16du" xmlns:w16sdtdh="http://schemas.microsoft.com/office/word/2020/wordml/sdtdatahash" xmlns:w16sdtfl="http://schemas.microsoft.com/office/word/2024/wordml/sdtformatlock" xmlns:w16se="http://schemas.microsoft.com/office/word/2015/wordml/symex" xmlns:wpg="http://schemas.microsoft.com/office/word/2010/wordprocessingGroup" xmlns:wpi="http://schemas.microsoft.com/office/word/2010/wordprocessingInk" xmlns:wne="http://schemas.microsoft.com/office/word/2006/wordml" xmlns:wps="http://schemas.microsoft.com/office/word/2010/wordprocessingShape" mc:Ignorable="w14 w15 w16se w16cid w16 w16cex w16sdtdh w16sdtfl w16du wp14">
+<w:document xmlns:wpc="http://schemas.microsoft.com/office/word/2010/wordprocessingCanvas" xmlns:cx="http://schemas.microsoft.com/office/drawing/2014/chartex" xmlns:cx1="http://schemas.microsoft.com/office/drawing/2015/9/8/chartex" xmlns:cx2="http://schemas.microsoft.com/office/drawing/2015/10/21/chartex" xmlns:cx3="http://schemas.microsoft.com/office/drawing/2016/5/9/chartex" xmlns:cx4="http://schemas.microsoft.com/office/drawing/2016/5/10/chartex" xmlns:cx5="http://schemas.microsoft.com/office/drawing/2016/5/11/chartex" xmlns:cx6="http://schemas.microsoft.com/office/drawing/2016/5/12/chartex" xmlns:cx7="http://schemas.microsoft.com/office/drawing/2016/5/13/chartex" xmlns:cx8="http://schemas.microsoft.com/office/drawing/2016/5/14/chartex" xmlns:mc="http://schemas.openxmlformats.org/markup-compatibility/2006" xmlns:m="http://schemas.openxmlformats.org/officeDocument/2006/math" xmlns:aink="http://schemas.microsoft.com/office/drawing/2016/ink" xmlns:am3d="http://schemas.microsoft.com/office/drawing/2017/model3d" xmlns:oel="http://schemas.microsoft.com/office/2019/extlst" xmlns:r="http://schemas.openxmlformats.org/officeDocument/2006/relationships" xmlns:wp14="http://schemas.microsoft.com/office/word/2010/wordprocessingDrawing" xmlns:wp="http://schemas.openxmlformats.org/drawingml/2006/wordprocessingDrawing" xmlns:wpg="http://schemas.microsoft.com/office/word/2010/wordprocessingGroup" xmlns:wpi="http://schemas.microsoft.com/office/word/2010/wordprocessingInk" xmlns:wps="http://schemas.microsoft.com/office/word/2010/wordprocessingShape" xmlns:o="urn:schemas-microsoft-com:office:office" xmlns:v="urn:schemas-microsoft-com:vml" xmlns:w10="urn:schemas-microsoft-com:office:word" xmlns:w="http://schemas.openxmlformats.org/wordprocessingml/2006/main" xmlns:w14="http://schemas.microsoft.com/office/word/2010/wordml" xmlns:w15="http://schemas.microsoft.com/office/word/2012/wordml" xmlns:w16cex="http://schemas.microsoft.com/office/word/2018/wordml/cex" xmlns:w16cid="http://schemas.microsoft.com/office/word/2016/wordml/cid" xmlns:w16="http://schemas.microsoft.com/office/word/2018/wordml" xmlns:w16sdtdh="http://schemas.microsoft.com/office/word/2020/wordml/sdtdatahash" xmlns:w16sdtfl="http://schemas.microsoft.com/office/word/2024/wordml/sdtformatlock" xmlns:w16se="http://schemas.microsoft.com/office/word/2015/wordml/symex" xmlns:w16du="http://schemas.microsoft.com/office/word/2023/wordml/word16du" xmlns:wne="http://schemas.microsoft.com/office/word/2006/wordml" mc:Ignorable="w14 w15 w16se w16cid w16 w16cex w16sdtdh w16sdtfl w16du wp14">
   <w:body>
     <w:p>
       <w:pPr>
@@ -770,6 +770,15 @@
               </w:rPr>
               <w:t>B</w:t>
             </w:r>
+          </w:p>
+          <w:p>
+            <w:pPr>
+              <w:spacing w:after="0"/>
+              <w:rPr>
+                <w:rFonts w:ascii="Arial" w:hAnsi="Arial"/>
+                <w:lang w:val="nl-NL"/>
+              </w:rPr>
+            </w:pPr>
           </w:p>
         </w:tc>
       </w:tr>
@@ -917,7 +926,7 @@
                 <w:bCs/>
                 <w:lang w:val="nl-NL"/>
               </w:rPr>
-              <w:t>2025 – Heden</w:t>
+              <w:t>2025 – 2026</w:t>
             </w:r>
           </w:p>
         </w:tc>
@@ -940,6 +949,92 @@
             </w:pPr>
             <w:r>
               <w:rPr>
+                <w:rFonts w:ascii="Arial" w:hAnsi="Arial" w:cs="Arial"/>
+                <w:lang w:val="en-GB"/>
+              </w:rPr>
+              <w:t>Applied data science and artificial intelligence (HBO)</w:t>
+            </w:r>
+          </w:p>
+        </w:tc>
+        <w:tc>
+          <w:tcPr>
+            <w:tcW w:w="1757" w:type="dxa"/>
+          </w:tcPr>
+          <w:p>
+            <w:pPr>
+              <w:widowControl w:val="0"/>
+              <w:autoSpaceDE w:val="0"/>
+              <w:autoSpaceDN w:val="0"/>
+              <w:adjustRightInd w:val="0"/>
+              <w:spacing w:after="0"/>
+              <w:rPr>
+                <w:rFonts w:ascii="Arial" w:hAnsi="Arial"/>
+                <w:bCs/>
+                <w:lang w:val="nl-NL"/>
+              </w:rPr>
+            </w:pPr>
+            <w:r>
+              <w:rPr>
+                <w:rFonts w:ascii="Arial" w:hAnsi="Arial"/>
+                <w:bCs/>
+                <w:lang w:val="nl-NL"/>
+              </w:rPr>
+              <w:t>Ja</w:t>
+            </w:r>
+          </w:p>
+        </w:tc>
+      </w:tr>
+      <w:tr>
+        <w:tc>
+          <w:tcPr>
+            <w:tcW w:w="1756" w:type="dxa"/>
+          </w:tcPr>
+          <w:p>
+            <w:pPr>
+              <w:widowControl w:val="0"/>
+              <w:autoSpaceDE w:val="0"/>
+              <w:autoSpaceDN w:val="0"/>
+              <w:adjustRightInd w:val="0"/>
+              <w:spacing w:after="0"/>
+              <w:rPr>
+                <w:rFonts w:ascii="Arial" w:hAnsi="Arial"/>
+                <w:lang w:val="nl-NL"/>
+              </w:rPr>
+            </w:pPr>
+            <w:r>
+              <w:rPr>
+                <w:rFonts w:ascii="Arial" w:hAnsi="Arial"/>
+                <w:lang w:val="nl-NL"/>
+              </w:rPr>
+              <w:t xml:space="preserve">2022 – </w:t>
+            </w:r>
+            <w:r>
+              <w:rPr>
+                <w:rFonts w:ascii="Arial" w:hAnsi="Arial"/>
+                <w:lang w:val="nl-NL"/>
+              </w:rPr>
+              <w:t>2026</w:t>
+            </w:r>
+          </w:p>
+        </w:tc>
+        <w:tc>
+          <w:tcPr>
+            <w:tcW w:w="5953" w:type="dxa"/>
+          </w:tcPr>
+          <w:p>
+            <w:pPr>
+              <w:widowControl w:val="0"/>
+              <w:autoSpaceDE w:val="0"/>
+              <w:autoSpaceDN w:val="0"/>
+              <w:adjustRightInd w:val="0"/>
+              <w:spacing w:after="0"/>
+              <w:rPr>
+                <w:rFonts w:ascii="Arial" w:hAnsi="Arial"/>
+                <w:lang w:val="en-GB"/>
+              </w:rPr>
+            </w:pPr>
+            <w:r>
+              <w:rPr>
                 <w:rFonts w:ascii="Arial" w:hAnsi="Arial"/>
                 <w:bCs/>
                 <w:lang w:val="en-GB"/>
@@ -977,9 +1072,9 @@
               <w:autoSpaceDN w:val="0"/>
               <w:adjustRightInd w:val="0"/>
               <w:spacing w:after="0"/>
-              <w:rPr>
-                <w:rFonts w:ascii="Arial" w:hAnsi="Arial"/>
-                <w:bCs/>
+              <w:jc w:val="both"/>
+              <w:rPr>
+                <w:rFonts w:ascii="Arial" w:hAnsi="Arial"/>
                 <w:lang w:val="nl-NL"/>
               </w:rPr>
             </w:pPr>
@@ -1016,49 +1111,47 @@
                 <w:rFonts w:ascii="Arial" w:hAnsi="Arial"/>
                 <w:lang w:val="nl-NL"/>
               </w:rPr>
-              <w:t>20</w:t>
-            </w:r>
-            <w:r>
-              <w:rPr>
-                <w:rFonts w:ascii="Arial" w:hAnsi="Arial"/>
-                <w:lang w:val="nl-NL"/>
-              </w:rPr>
-              <w:t>22</w:t>
-            </w:r>
-            <w:r>
-              <w:rPr>
-                <w:rFonts w:ascii="Arial" w:hAnsi="Arial"/>
-                <w:lang w:val="nl-NL"/>
-              </w:rPr>
-              <w:t xml:space="preserve"> </w:t>
-            </w:r>
-            <w:r>
-              <w:rPr>
-                <w:rFonts w:ascii="Arial" w:hAnsi="Arial"/>
-                <w:lang w:val="nl-NL"/>
-              </w:rPr>
-              <w:t>–</w:t>
-            </w:r>
-            <w:r>
-              <w:rPr>
-                <w:rFonts w:ascii="Arial" w:hAnsi="Arial"/>
-                <w:lang w:val="nl-NL"/>
-              </w:rPr>
-              <w:t xml:space="preserve"> </w:t>
-            </w:r>
-            <w:r>
-              <w:rPr>
-                <w:rFonts w:ascii="Arial" w:hAnsi="Arial"/>
-                <w:lang w:val="nl-NL"/>
-              </w:rPr>
-              <w:t>H</w:t>
-            </w:r>
-            <w:r>
-              <w:rPr>
-                <w:rFonts w:ascii="Arial" w:hAnsi="Arial"/>
-                <w:lang w:val="nl-NL"/>
-              </w:rPr>
-              <w:t>eden</w:t>
+              <w:t>2020 – 2022</w:t>
+            </w:r>
+          </w:p>
+          <w:p>
+            <w:pPr>
+              <w:widowControl w:val="0"/>
+              <w:autoSpaceDE w:val="0"/>
+              <w:autoSpaceDN w:val="0"/>
+              <w:adjustRightInd w:val="0"/>
+              <w:spacing w:after="0"/>
+              <w:rPr>
+                <w:rFonts w:ascii="Arial" w:hAnsi="Arial"/>
+                <w:lang w:val="nl-NL"/>
+              </w:rPr>
+            </w:pPr>
+            <w:r>
+              <w:rPr>
+                <w:rFonts w:ascii="Arial" w:hAnsi="Arial"/>
+                <w:lang w:val="nl-NL"/>
+              </w:rPr>
+              <w:t>2020 – 2020</w:t>
+            </w:r>
+          </w:p>
+          <w:p>
+            <w:pPr>
+              <w:widowControl w:val="0"/>
+              <w:autoSpaceDE w:val="0"/>
+              <w:autoSpaceDN w:val="0"/>
+              <w:adjustRightInd w:val="0"/>
+              <w:spacing w:after="0"/>
+              <w:rPr>
+                <w:rFonts w:ascii="Arial" w:hAnsi="Arial"/>
+                <w:lang w:val="nl-NL"/>
+              </w:rPr>
+            </w:pPr>
+            <w:r>
+              <w:rPr>
+                <w:rFonts w:ascii="Arial" w:hAnsi="Arial"/>
+                <w:lang w:val="nl-NL"/>
+              </w:rPr>
+              <w:t>2020 – 2020</w:t>
             </w:r>
           </w:p>
         </w:tc>
@@ -1075,180 +1168,6 @@
               <w:spacing w:after="0"/>
               <w:rPr>
                 <w:rFonts w:ascii="Arial" w:hAnsi="Arial"/>
-                <w:lang w:val="en-GB"/>
-              </w:rPr>
-            </w:pPr>
-            <w:r>
-              <w:rPr>
-                <w:rFonts w:ascii="Arial" w:hAnsi="Arial" w:cs="Arial"/>
-                <w:lang w:val="en-GB"/>
-              </w:rPr>
-              <w:t>A</w:t>
-            </w:r>
-            <w:r>
-              <w:rPr>
-                <w:rFonts w:ascii="Arial" w:hAnsi="Arial" w:cs="Arial"/>
-                <w:lang w:val="en-GB"/>
-              </w:rPr>
-              <w:t>pplied data science and artificial intelligence</w:t>
-            </w:r>
-            <w:r>
-              <w:rPr>
-                <w:rFonts w:ascii="Arial" w:hAnsi="Arial" w:cs="Arial"/>
-                <w:lang w:val="en-GB"/>
-              </w:rPr>
-              <w:t xml:space="preserve"> </w:t>
-            </w:r>
-            <w:r>
-              <w:rPr>
-                <w:rFonts w:ascii="Arial" w:hAnsi="Arial" w:cs="Arial"/>
-                <w:lang w:val="en-GB"/>
-              </w:rPr>
-              <w:t>(HBO)</w:t>
-            </w:r>
-          </w:p>
-        </w:tc>
-        <w:tc>
-          <w:tcPr>
-            <w:tcW w:w="1757" w:type="dxa"/>
-          </w:tcPr>
-          <w:p>
-            <w:pPr>
-              <w:widowControl w:val="0"/>
-              <w:autoSpaceDE w:val="0"/>
-              <w:autoSpaceDN w:val="0"/>
-              <w:adjustRightInd w:val="0"/>
-              <w:spacing w:after="0"/>
-              <w:jc w:val="both"/>
-              <w:rPr>
-                <w:rFonts w:ascii="Arial" w:hAnsi="Arial"/>
-                <w:lang w:val="nl-NL"/>
-              </w:rPr>
-            </w:pPr>
-            <w:r>
-              <w:rPr>
-                <w:rFonts w:ascii="Arial" w:hAnsi="Arial"/>
-                <w:lang w:val="nl-NL"/>
-              </w:rPr>
-              <w:t>J</w:t>
-            </w:r>
-            <w:r>
-              <w:rPr>
-                <w:rFonts w:ascii="Arial" w:hAnsi="Arial"/>
-                <w:lang w:val="nl-NL"/>
-              </w:rPr>
-              <w:t>a</w:t>
-            </w:r>
-          </w:p>
-        </w:tc>
-      </w:tr>
-      <w:tr>
-        <w:tc>
-          <w:tcPr>
-            <w:tcW w:w="1756" w:type="dxa"/>
-          </w:tcPr>
-          <w:p>
-            <w:pPr>
-              <w:widowControl w:val="0"/>
-              <w:autoSpaceDE w:val="0"/>
-              <w:autoSpaceDN w:val="0"/>
-              <w:adjustRightInd w:val="0"/>
-              <w:spacing w:after="0"/>
-              <w:rPr>
-                <w:rFonts w:ascii="Arial" w:hAnsi="Arial"/>
-                <w:lang w:val="nl-NL"/>
-              </w:rPr>
-            </w:pPr>
-            <w:r>
-              <w:rPr>
-                <w:rFonts w:ascii="Arial" w:hAnsi="Arial"/>
-                <w:lang w:val="nl-NL"/>
-              </w:rPr>
-              <w:t>2020</w:t>
-            </w:r>
-            <w:r>
-              <w:rPr>
-                <w:rFonts w:ascii="Arial" w:hAnsi="Arial"/>
-                <w:lang w:val="nl-NL"/>
-              </w:rPr>
-              <w:t xml:space="preserve"> </w:t>
-            </w:r>
-            <w:r>
-              <w:rPr>
-                <w:rFonts w:ascii="Arial" w:hAnsi="Arial"/>
-                <w:lang w:val="nl-NL"/>
-              </w:rPr>
-              <w:t>–</w:t>
-            </w:r>
-            <w:r>
-              <w:rPr>
-                <w:rFonts w:ascii="Arial" w:hAnsi="Arial"/>
-                <w:lang w:val="nl-NL"/>
-              </w:rPr>
-              <w:t xml:space="preserve"> </w:t>
-            </w:r>
-            <w:r>
-              <w:rPr>
-                <w:rFonts w:ascii="Arial" w:hAnsi="Arial"/>
-                <w:lang w:val="nl-NL"/>
-              </w:rPr>
-              <w:t>2022</w:t>
-            </w:r>
-          </w:p>
-          <w:p>
-            <w:pPr>
-              <w:widowControl w:val="0"/>
-              <w:autoSpaceDE w:val="0"/>
-              <w:autoSpaceDN w:val="0"/>
-              <w:adjustRightInd w:val="0"/>
-              <w:spacing w:after="0"/>
-              <w:rPr>
-                <w:rFonts w:ascii="Arial" w:hAnsi="Arial"/>
-                <w:lang w:val="nl-NL"/>
-              </w:rPr>
-            </w:pPr>
-            <w:r>
-              <w:rPr>
-                <w:rFonts w:ascii="Arial" w:hAnsi="Arial"/>
-                <w:lang w:val="nl-NL"/>
-              </w:rPr>
-              <w:t>2020 – 2020</w:t>
-            </w:r>
-          </w:p>
-          <w:p>
-            <w:pPr>
-              <w:widowControl w:val="0"/>
-              <w:autoSpaceDE w:val="0"/>
-              <w:autoSpaceDN w:val="0"/>
-              <w:adjustRightInd w:val="0"/>
-              <w:spacing w:after="0"/>
-              <w:rPr>
-                <w:rFonts w:ascii="Arial" w:hAnsi="Arial"/>
-                <w:lang w:val="nl-NL"/>
-              </w:rPr>
-            </w:pPr>
-            <w:r>
-              <w:rPr>
-                <w:rFonts w:ascii="Arial" w:hAnsi="Arial"/>
-                <w:lang w:val="nl-NL"/>
-              </w:rPr>
-              <w:t>2020 – 2020</w:t>
-            </w:r>
-          </w:p>
-        </w:tc>
-        <w:tc>
-          <w:tcPr>
-            <w:tcW w:w="5953" w:type="dxa"/>
-          </w:tcPr>
-          <w:p>
-            <w:pPr>
-              <w:widowControl w:val="0"/>
-              <w:autoSpaceDE w:val="0"/>
-              <w:autoSpaceDN w:val="0"/>
-              <w:adjustRightInd w:val="0"/>
-              <w:spacing w:after="0"/>
-              <w:rPr>
-                <w:rFonts w:ascii="Arial" w:hAnsi="Arial"/>
                 <w:lang w:val="nl-NL"/>
               </w:rPr>
             </w:pPr>
@@ -1277,21 +1196,7 @@
                 <w:rFonts w:ascii="Arial" w:hAnsi="Arial"/>
                 <w:lang w:val="nl-NL"/>
               </w:rPr>
-              <w:t>P</w:t>
-            </w:r>
-            <w:r>
-              <w:rPr>
-                <w:rFonts w:ascii="Arial" w:hAnsi="Arial"/>
-                <w:lang w:val="nl-NL"/>
-              </w:rPr>
-              <w:t xml:space="preserve">ython beginner course </w:t>
-            </w:r>
-            <w:r>
-              <w:rPr>
-                <w:rFonts w:ascii="Arial" w:hAnsi="Arial"/>
-                <w:lang w:val="nl-NL"/>
-              </w:rPr>
-              <w:t>Radboud Nijmegen</w:t>
+              <w:t>Python beginner course Radboud Nijmegen</w:t>
             </w:r>
           </w:p>
           <w:p>
@@ -1310,14 +1215,7 @@
                 <w:rFonts w:ascii="Arial" w:hAnsi="Arial" w:cs="Arial"/>
                 <w:lang w:val="nl-NL"/>
               </w:rPr>
-              <w:t>K</w:t>
-            </w:r>
-            <w:r>
-              <w:rPr>
-                <w:rFonts w:ascii="Arial" w:hAnsi="Arial" w:cs="Arial"/>
-                <w:lang w:val="nl-NL"/>
-              </w:rPr>
-              <w:t xml:space="preserve">ennismaking robotica hogeschool Utrecht </w:t>
+              <w:t xml:space="preserve">Kennismaking robotica hogeschool Utrecht </w:t>
             </w:r>
           </w:p>
         </w:tc>
@@ -1342,21 +1240,7 @@
                 <w:rFonts w:ascii="Arial" w:hAnsi="Arial"/>
                 <w:lang w:val="nl-NL"/>
               </w:rPr>
-              <w:t>J</w:t>
-            </w:r>
-            <w:r>
-              <w:rPr>
-                <w:rFonts w:ascii="Arial" w:hAnsi="Arial"/>
-                <w:lang w:val="nl-NL"/>
-              </w:rPr>
-              <w:t>a</w:t>
-            </w:r>
-            <w:r>
-              <w:rPr>
-                <w:rFonts w:ascii="Arial" w:hAnsi="Arial"/>
-                <w:lang w:val="nl-NL"/>
-              </w:rPr>
-              <w:t xml:space="preserve"> </w:t>
+              <w:t xml:space="preserve">Ja </w:t>
             </w:r>
           </w:p>
           <w:p>
@@ -1423,35 +1307,7 @@
                 <w:rFonts w:ascii="Arial" w:hAnsi="Arial"/>
                 <w:lang w:val="nl-NL"/>
               </w:rPr>
-              <w:t>2016</w:t>
-            </w:r>
-            <w:r>
-              <w:rPr>
-                <w:rFonts w:ascii="Arial" w:hAnsi="Arial"/>
-                <w:lang w:val="nl-NL"/>
-              </w:rPr>
-              <w:t xml:space="preserve"> </w:t>
-            </w:r>
-            <w:r>
-              <w:rPr>
-                <w:rFonts w:ascii="Arial" w:hAnsi="Arial"/>
-                <w:lang w:val="nl-NL"/>
-              </w:rPr>
-              <w:t>–</w:t>
-            </w:r>
-            <w:r>
-              <w:rPr>
-                <w:rFonts w:ascii="Arial" w:hAnsi="Arial"/>
-                <w:lang w:val="nl-NL"/>
-              </w:rPr>
-              <w:t xml:space="preserve"> </w:t>
-            </w:r>
-            <w:r>
-              <w:rPr>
-                <w:rFonts w:ascii="Arial" w:hAnsi="Arial"/>
-                <w:lang w:val="nl-NL"/>
-              </w:rPr>
-              <w:t>2020</w:t>
+              <w:t>2016 – 2020</w:t>
             </w:r>
           </w:p>
         </w:tc>
@@ -1501,14 +1357,7 @@
                 <w:rFonts w:ascii="Arial" w:hAnsi="Arial"/>
                 <w:lang w:val="nl-NL"/>
               </w:rPr>
-              <w:t>J</w:t>
-            </w:r>
-            <w:r>
-              <w:rPr>
-                <w:rFonts w:ascii="Arial" w:hAnsi="Arial"/>
-                <w:lang w:val="nl-NL"/>
-              </w:rPr>
-              <w:t>a</w:t>
+              <w:t>Ja</w:t>
             </w:r>
           </w:p>
         </w:tc>
@@ -1779,7 +1628,7 @@
                 <w:sz w:val="20"/>
                 <w:lang w:val="nl-NL"/>
               </w:rPr>
-              <w:t>heden</w:t>
+              <w:t>2026</w:t>
             </w:r>
           </w:p>
         </w:tc>
@@ -1874,23 +1723,7 @@
                 <w:sz w:val="20"/>
                 <w:lang w:val="nl-NL"/>
               </w:rPr>
-              <w:t xml:space="preserve">Studerend </w:t>
-            </w:r>
-            <w:r>
-              <w:rPr>
-                <w:rFonts w:ascii="Arial" w:hAnsi="Arial"/>
-                <w:sz w:val="20"/>
-                <w:lang w:val="nl-NL"/>
-              </w:rPr>
-              <w:t>3</w:t>
-            </w:r>
-            <w:r>
-              <w:rPr>
-                <w:rFonts w:ascii="Arial" w:hAnsi="Arial"/>
-                <w:sz w:val="20"/>
-                <w:lang w:val="nl-NL"/>
-              </w:rPr>
-              <w:t xml:space="preserve">de jaar </w:t>
+              <w:t xml:space="preserve">Diploma gehaald </w:t>
             </w:r>
           </w:p>
           <w:p>
@@ -2249,7 +2082,7 @@
                 <w:sz w:val="20"/>
                 <w:lang w:val="nl-NL"/>
               </w:rPr>
-              <w:t>Ja</w:t>
+              <w:t xml:space="preserve">Diploma gehaald </w:t>
             </w:r>
           </w:p>
         </w:tc>
@@ -2758,6 +2591,65 @@
                 <w:sz w:val="20"/>
                 <w:lang w:val="nl-NL"/>
               </w:rPr>
+              <w:t xml:space="preserve">2026 – </w:t>
+            </w:r>
+            <w:proofErr w:type="spellStart"/>
+            <w:r>
+              <w:rPr>
+                <w:rFonts w:ascii="Arial" w:hAnsi="Arial"/>
+                <w:bCs/>
+                <w:sz w:val="20"/>
+                <w:lang w:val="nl-NL"/>
+              </w:rPr>
+              <w:t>now</w:t>
+            </w:r>
+            <w:proofErr w:type="spellEnd"/>
+          </w:p>
+          <w:p>
+            <w:pPr>
+              <w:widowControl w:val="0"/>
+              <w:autoSpaceDE w:val="0"/>
+              <w:autoSpaceDN w:val="0"/>
+              <w:adjustRightInd w:val="0"/>
+              <w:spacing w:after="0"/>
+              <w:rPr>
+                <w:rFonts w:ascii="Arial" w:hAnsi="Arial"/>
+                <w:bCs/>
+                <w:sz w:val="20"/>
+                <w:lang w:val="nl-NL"/>
+              </w:rPr>
+            </w:pPr>
+            <w:r>
+              <w:rPr>
+                <w:rFonts w:ascii="Arial" w:hAnsi="Arial"/>
+                <w:bCs/>
+                <w:sz w:val="20"/>
+                <w:lang w:val="nl-NL"/>
+              </w:rPr>
+              <w:t>2026 – 2026</w:t>
+            </w:r>
+          </w:p>
+          <w:p>
+            <w:pPr>
+              <w:widowControl w:val="0"/>
+              <w:autoSpaceDE w:val="0"/>
+              <w:autoSpaceDN w:val="0"/>
+              <w:adjustRightInd w:val="0"/>
+              <w:spacing w:after="0"/>
+              <w:rPr>
+                <w:rFonts w:ascii="Arial" w:hAnsi="Arial"/>
+                <w:bCs/>
+                <w:sz w:val="20"/>
+                <w:lang w:val="nl-NL"/>
+              </w:rPr>
+            </w:pPr>
+            <w:r>
+              <w:rPr>
+                <w:rFonts w:ascii="Arial" w:hAnsi="Arial"/>
+                <w:bCs/>
+                <w:sz w:val="20"/>
+                <w:lang w:val="nl-NL"/>
+              </w:rPr>
               <w:t>2025 – 2025</w:t>
             </w:r>
           </w:p>
@@ -3057,6 +2949,67 @@
               <w:spacing w:after="0"/>
               <w:rPr>
                 <w:rFonts w:ascii="Arial" w:hAnsi="Arial"/>
+                <w:bCs/>
+                <w:sz w:val="20"/>
+                <w:lang w:val="nl-NL"/>
+              </w:rPr>
+            </w:pPr>
+            <w:r>
+              <w:rPr>
+                <w:rStyle w:val="rynqvb"/>
+                <w:lang w:val="nl-NL"/>
+              </w:rPr>
+              <w:t>Parttime junior data-engineer</w:t>
+            </w:r>
+          </w:p>
+          <w:p>
+            <w:pPr>
+              <w:widowControl w:val="0"/>
+              <w:autoSpaceDE w:val="0"/>
+              <w:autoSpaceDN w:val="0"/>
+              <w:adjustRightInd w:val="0"/>
+              <w:spacing w:after="0"/>
+              <w:rPr>
+                <w:rFonts w:ascii="Arial" w:hAnsi="Arial"/>
+                <w:b/>
+                <w:sz w:val="20"/>
+                <w:lang w:val="nl-NL"/>
+              </w:rPr>
+            </w:pPr>
+            <w:r>
+              <w:rPr>
+                <w:rFonts w:ascii="Arial" w:hAnsi="Arial"/>
+                <w:sz w:val="20"/>
+                <w:lang w:val="nl-NL"/>
+              </w:rPr>
+              <w:t>Data engineer</w:t>
+            </w:r>
+            <w:r>
+              <w:rPr>
+                <w:rFonts w:ascii="Arial" w:hAnsi="Arial"/>
+                <w:sz w:val="20"/>
+                <w:lang w:val="nl-NL"/>
+              </w:rPr>
+              <w:t xml:space="preserve"> </w:t>
+            </w:r>
+            <w:r>
+              <w:rPr>
+                <w:rFonts w:ascii="Arial" w:hAnsi="Arial"/>
+                <w:sz w:val="20"/>
+                <w:lang w:val="nl-NL"/>
+              </w:rPr>
+              <w:t>(afstudeeropdracht)</w:t>
+            </w:r>
+          </w:p>
+          <w:p>
+            <w:pPr>
+              <w:widowControl w:val="0"/>
+              <w:autoSpaceDE w:val="0"/>
+              <w:autoSpaceDN w:val="0"/>
+              <w:adjustRightInd w:val="0"/>
+              <w:spacing w:after="0"/>
+              <w:rPr>
+                <w:rFonts w:ascii="Arial" w:hAnsi="Arial"/>
                 <w:sz w:val="20"/>
                 <w:lang w:val="nl-NL"/>
               </w:rPr>
@@ -3412,18 +3365,117 @@
                 <w:rFonts w:ascii="Arial" w:hAnsi="Arial"/>
                 <w:bCs/>
                 <w:sz w:val="20"/>
-                <w:lang w:val="nl-NL"/>
-              </w:rPr>
-            </w:pPr>
+                <w:lang w:val="en-US"/>
+              </w:rPr>
+            </w:pPr>
+            <w:proofErr w:type="spellStart"/>
             <w:r>
               <w:rPr>
                 <w:rFonts w:ascii="Arial" w:hAnsi="Arial"/>
                 <w:bCs/>
                 <w:sz w:val="20"/>
+                <w:lang w:val="en-US"/>
+              </w:rPr>
+              <w:t>Play</w:t>
+            </w:r>
+            <w:r>
+              <w:rPr>
+                <w:rFonts w:ascii="Arial" w:hAnsi="Arial"/>
+                <w:bCs/>
+                <w:sz w:val="20"/>
+                <w:lang w:val="en-US"/>
+              </w:rPr>
+              <w:t>Smart</w:t>
+            </w:r>
+            <w:proofErr w:type="spellEnd"/>
+            <w:r>
+              <w:rPr>
+                <w:rFonts w:ascii="Arial" w:hAnsi="Arial"/>
+                <w:bCs/>
+                <w:sz w:val="20"/>
+                <w:lang w:val="en-US"/>
+              </w:rPr>
+              <w:t>/B</w:t>
+            </w:r>
+            <w:r>
+              <w:rPr>
+                <w:rFonts w:ascii="Arial" w:hAnsi="Arial"/>
+                <w:bCs/>
+                <w:sz w:val="20"/>
+                <w:lang w:val="en-US"/>
+              </w:rPr>
+              <w:t>u</w:t>
+            </w:r>
+            <w:r>
+              <w:rPr>
+                <w:rFonts w:ascii="Arial" w:hAnsi="Arial"/>
+                <w:bCs/>
+                <w:sz w:val="20"/>
+                <w:lang w:val="en-US"/>
+              </w:rPr>
+              <w:t>as</w:t>
+            </w:r>
+          </w:p>
+          <w:p>
+            <w:pPr>
+              <w:widowControl w:val="0"/>
+              <w:autoSpaceDE w:val="0"/>
+              <w:autoSpaceDN w:val="0"/>
+              <w:adjustRightInd w:val="0"/>
+              <w:spacing w:after="0"/>
+              <w:rPr>
+                <w:rFonts w:ascii="Arial" w:hAnsi="Arial"/>
+                <w:bCs/>
+                <w:sz w:val="20"/>
+                <w:lang w:val="en-US"/>
+              </w:rPr>
+            </w:pPr>
+            <w:r>
+              <w:rPr>
+                <w:rFonts w:ascii="Arial" w:hAnsi="Arial"/>
+                <w:bCs/>
+                <w:sz w:val="20"/>
+                <w:lang w:val="en-US"/>
+              </w:rPr>
+              <w:t xml:space="preserve">Breda Guardians/ </w:t>
+            </w:r>
+            <w:proofErr w:type="spellStart"/>
+            <w:r>
+              <w:rPr>
+                <w:rFonts w:ascii="Arial" w:hAnsi="Arial"/>
+                <w:bCs/>
+                <w:sz w:val="20"/>
+                <w:lang w:val="en-US"/>
+              </w:rPr>
+              <w:t>BUas</w:t>
+            </w:r>
+            <w:proofErr w:type="spellEnd"/>
+          </w:p>
+          <w:p>
+            <w:pPr>
+              <w:widowControl w:val="0"/>
+              <w:autoSpaceDE w:val="0"/>
+              <w:autoSpaceDN w:val="0"/>
+              <w:adjustRightInd w:val="0"/>
+              <w:spacing w:after="0"/>
+              <w:rPr>
+                <w:rFonts w:ascii="Arial" w:hAnsi="Arial"/>
+                <w:bCs/>
+                <w:sz w:val="20"/>
+                <w:lang w:val="nl-NL"/>
+              </w:rPr>
+            </w:pPr>
+            <w:proofErr w:type="spellStart"/>
+            <w:r>
+              <w:rPr>
+                <w:rFonts w:ascii="Arial" w:hAnsi="Arial"/>
+                <w:bCs/>
+                <w:sz w:val="20"/>
                 <w:lang w:val="nl-NL"/>
               </w:rPr>
               <w:t>Stedin</w:t>
             </w:r>
+            <w:proofErr w:type="spellEnd"/>
           </w:p>
           <w:p>
             <w:pPr>
@@ -4465,7 +4517,6 @@
           <w:szCs w:val="32"/>
           <w:lang w:val="en-GB"/>
         </w:rPr>
-        <w:lastRenderedPageBreak/>
         <w:t>Skills and software skills:</w:t>
       </w:r>
     </w:p>
@@ -4492,7 +4543,7 @@
           <w:szCs w:val="24"/>
           <w:lang w:val="en-GB"/>
         </w:rPr>
-        <w:t xml:space="preserve">I have around </w:t>
+        <w:t xml:space="preserve">I have </w:t>
       </w:r>
       <w:r>
         <w:rPr>
@@ -4806,6 +4857,32 @@
     </w:p>
     <w:p>
       <w:pPr>
+        <w:pStyle w:val="ListParagraph"/>
+        <w:numPr>
+          <w:ilvl w:val="0"/>
+          <w:numId w:val="1"/>
+        </w:numPr>
+        <w:rPr>
+          <w:rFonts w:ascii="Arial" w:hAnsi="Arial"/>
+          <w:bCs/>
+          <w:sz w:val="24"/>
+          <w:szCs w:val="24"/>
+          <w:lang w:val="en-GB"/>
+        </w:rPr>
+      </w:pPr>
+      <w:r>
+        <w:rPr>
+          <w:rFonts w:ascii="Arial" w:hAnsi="Arial"/>
+          <w:bCs/>
+          <w:sz w:val="24"/>
+          <w:szCs w:val="24"/>
+          <w:lang w:val="en-GB"/>
+        </w:rPr>
+        <w:t>I have set up branching strategies for a research project</w:t>
+      </w:r>
+    </w:p>
+    <w:p>
+      <w:pPr>
         <w:rPr>
           <w:rFonts w:ascii="Arial" w:hAnsi="Arial"/>
           <w:b/>
@@ -4843,7 +4920,56 @@
           <w:szCs w:val="24"/>
           <w:lang w:val="en-GB"/>
         </w:rPr>
-        <w:t>Dashboard pipeline:</w:t>
+        <w:t>Graduation project:</w:t>
+      </w:r>
+    </w:p>
+    <w:p>
+      <w:pPr>
+        <w:pStyle w:val="NormalWeb"/>
+      </w:pPr>
+      <w:r>
+        <w:t>Formalising deployment for the Breda Guardians Esports Analytics Toolkit, my graduation thesis project at The Hive, Breda University of Applied Sciences (BUas). The Play-Smart toolkit, an earlier prototype built by students, captured player performance data through eye tracking, facial emotion recognition, and keyboard/mouse input, feeding into a dashboard for esports coaching. The problem this project addressed was that deployment of the toolkit was still entirely manual: files were carried between machines by USB, paths were hard-coded, and the environment had to be reconstructed by hand on every new PC, which had become slow, fragile, and increasingly unworkable as more contributors and institutions (Tilburg University and the University of Twente) joined the project.</w:t>
+      </w:r>
+    </w:p>
+    <w:p>
+      <w:pPr>
+        <w:pStyle w:val="NormalWeb"/>
+      </w:pPr>
+      <w:r>
+        <w:t>Because of this, the project came down to migrating the toolkit from that manual, USB-based process to a consolidated, version-controlled workflow built around GitHub, and evaluating whether that migration actually improved things, both in deployment speed and in the experience of the people doing the deployments.</w:t>
+      </w:r>
+    </w:p>
+    <w:p>
+      <w:pPr>
+        <w:pStyle w:val="NormalWeb"/>
+      </w:pPr>
+      <w:r>
+        <w:t>I started by designing a branching strategy that could handle two problems at once: letting partner institutions work independently while BUas kept control over what got merged back, and giving student contributors enough structure to avoid mistakes without killing their ability to experiment. I solved this with a hybrid approach, a forking model between institutions combined with a Git-Flow-style main branch and GitHub-Flow-style feature branches within each institutional fork. I also built an automated deployment pipeline using GitHub Actions that detects which service changed (backend, frontend, pipeline, or inference container) and rebuilds and redeploys only that one, reducing both manual effort and the chance of human error.</w:t>
+      </w:r>
+    </w:p>
+    <w:p>
+      <w:pPr>
+        <w:pStyle w:val="NormalWeb"/>
+      </w:pPr>
+      <w:r>
+        <w:t>To evaluate whether this new workflow was actually better, not just faster on paper, I ran a within-subjects usability study with four experienced project contributors, each of whom deployed the toolkit using both the old manual method and the new GitHub-based method, while I measured deployment time and collected their experience through a questionnaire built on the Technology Acceptance Model and the DORA and SPACE frameworks.</w:t>
+      </w:r>
+    </w:p>
+    <w:p>
+      <w:pPr>
+        <w:pStyle w:val="NormalWeb"/>
+      </w:pPr>
+      <w:r>
+        <w:t>The results were consistent across all four participants: the GitHub-based method was faster for everyone, taking roughly 8 to 12 minutes compared to 22 to 33 minutes manually, with most of the manual time lost to USB transfer problems rather than the actual toolkit setup. It was also rated easier to use, less mentally demanding, more reliable, and more likely to be reused by every single participant. The automated pipeline itself also behaved as intended in production, correctly rebuilding and redeploying only the changed containers on real merges.</w:t>
+      </w:r>
+    </w:p>
+    <w:p>
+      <w:pPr>
+        <w:pStyle w:val="NormalWeb"/>
+      </w:pPr>
+      <w:r>
+        <w:lastRenderedPageBreak/>
+        <w:t>In conclusion, the study supported adopting the new version-controlled workflow as the standard way of deploying the toolkit going forward, and I documented the remaining limitations (small sample size, only tested with experienced users, some inconsistency in dependency distribution) as directions for future work.</w:t>
       </w:r>
     </w:p>
     <w:p>
@@ -4853,7 +4979,69 @@
           <w:b/>
           <w:sz w:val="32"/>
           <w:szCs w:val="32"/>
-          <w:lang w:val="en-GB"/>
+        </w:rPr>
+      </w:pPr>
+    </w:p>
+    <w:p>
+      <w:pPr>
+        <w:rPr>
+          <w:rFonts w:ascii="Arial" w:hAnsi="Arial"/>
+          <w:b/>
+          <w:sz w:val="24"/>
+          <w:szCs w:val="24"/>
+          <w:lang w:val="en-GB"/>
+        </w:rPr>
+      </w:pPr>
+      <w:r>
+        <w:rPr>
+          <w:rFonts w:ascii="Arial" w:hAnsi="Arial"/>
+          <w:b/>
+          <w:sz w:val="24"/>
+          <w:szCs w:val="24"/>
+          <w:lang w:val="en-GB"/>
+        </w:rPr>
+        <w:t>Dashboard pipeline:</w:t>
+      </w:r>
+    </w:p>
+    <w:p>
+      <w:pPr>
+        <w:pStyle w:val="NormalWeb"/>
+      </w:pPr>
+      <w:r>
+        <w:t>Making a Power BI dashboard for Stedin, an electricity and gas company in the Netherlands, to monitor the quality of the green gas fed into their network from 12 locations across the country. This project was for Stedin's green gas department, who previously only received quality reports every 6 months from a third party and had no easy way to check the gas quality themselves without manually downloading and processing data per location, a process that took 15 to 30 minutes each time. Because of this, the project came down to building a dashboard that tracks all the relevant gas values, Oxygen, Carbon dioxide, water dew point, pressure, Hydrogen sulphide, and Wobbe index, and automating the process of getting that data onto it.</w:t>
+      </w:r>
+    </w:p>
+    <w:p>
+      <w:pPr>
+        <w:pStyle w:val="NormalWeb"/>
+      </w:pPr>
+      <w:r>
+        <w:t>We started with data collection, which comes from a third-party company called TeleControlNet (TCN) that compiles data from all the feeder locations. Since TCN's API didn't allow downloading data in the format needed, I used robotic process automation (RPA) in Python to mimic the actions of a user downloading the data manually from the website.</w:t>
+      </w:r>
+    </w:p>
+    <w:p>
+      <w:pPr>
+        <w:pStyle w:val="NormalWeb"/>
+      </w:pPr>
+      <w:r>
+        <w:t>After downloading, the data needed to be cleaned and filtered before it could be used, since the amount and quality of data varied a lot between locations. During this process I found a few anomalies: one location measured pressure differently than the others (not a real problem, just an inconsistency in units), and three other locations had a large percentage of missing data in one column because a provider had set up recording differently than the rest of the system, which meant that column had to be dropped for those locations to keep the rest of the data usable.</w:t>
+      </w:r>
+    </w:p>
+    <w:p>
+      <w:pPr>
+        <w:pStyle w:val="NormalWeb"/>
+      </w:pPr>
+      <w:r>
+        <w:t>The last part of the project was to automate the whole pipeline and finish the dashboard. I built an executable application that runs the RPA download, moves and renames the data, cleans and filters it, and saves it to an export folder connected to a SharePoint location that feeds directly into the Power BI dashboard. This meant my supervisors could refresh the dashboard themselves without needing to touch the underlying code. I also built a custom Wobbe index visual in Power BI using a Python visual, translating an existing Excel-based calculation into Python logic, since there was no standard way to replicate it in Power BI.</w:t>
+      </w:r>
+    </w:p>
+    <w:p>
+      <w:pPr>
+        <w:rPr>
+          <w:rFonts w:ascii="Arial" w:hAnsi="Arial"/>
+          <w:b/>
+          <w:sz w:val="32"/>
+          <w:szCs w:val="32"/>
         </w:rPr>
       </w:pPr>
     </w:p>
@@ -5185,6 +5373,7 @@
           <w:szCs w:val="24"/>
           <w:lang w:val="en-GB"/>
         </w:rPr>
+        <w:lastRenderedPageBreak/>
         <w:t>The last part of the project is to automate</w:t>
       </w:r>
       <w:r>
@@ -6091,7 +6280,7 @@
           </mc:Choice>
           <mc:Fallback>
             <w:pict>
-              <v:group w14:anchorId="30715E3E" id="Group 7" o:spid="_x0000_s1026" style="width:523.3pt;height:189.3pt;mso-position-horizontal-relative:char;mso-position-vertical-relative:line" coordsize="68470,24772" o:gfxdata="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">
+              <v:group w14:anchorId="30715E3E" id="Group 7" o:spid="_x0000_s1026" style="width:523.3pt;height:189.3pt;mso-position-horizontal-relative:char;mso-position-vertical-relative:line" coordsize="68470,24772" o:gfxdata="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">
                 <v:shapetype id="_x0000_t75" coordsize="21600,21600" o:spt="75" o:preferrelative="t" path="m@4@5l@4@11@9@11@9@5xe" filled="f" stroked="f">
                   <v:stroke joinstyle="miter"/>
                   <v:formulas>
@@ -6111,20 +6300,20 @@
                   <v:path o:extrusionok="f" gradientshapeok="t" o:connecttype="rect"/>
                   <o:lock v:ext="edit" aspectratio="t"/>
                 </v:shapetype>
-                <v:shape id="Picture 3" o:spid="_x0000_s1027" type="#_x0000_t75" style="position:absolute;left:98;top:98;width:21521;height:20714;visibility:visible;mso-wrap-style:square" o:gfxdata="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">
+                <v:shape id="Picture 3" o:spid="_x0000_s1027" type="#_x0000_t75" style="position:absolute;left:98;top:98;width:21521;height:20714;visibility:visible;mso-wrap-style:square" o:gfxdata="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">
                   <v:imagedata r:id="rId13" o:title=""/>
                 </v:shape>
-                <v:shape id="Picture 4" o:spid="_x0000_s1028" type="#_x0000_t75" style="position:absolute;left:23576;top:98;width:21603;height:20803;visibility:visible;mso-wrap-style:square" o:gfxdata="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">
+                <v:shape id="Picture 4" o:spid="_x0000_s1028" type="#_x0000_t75" style="position:absolute;left:23576;top:98;width:21603;height:20803;visibility:visible;mso-wrap-style:square" o:gfxdata="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">
                   <v:imagedata r:id="rId14" o:title=""/>
                 </v:shape>
-                <v:shape id="Picture 5" o:spid="_x0000_s1029" type="#_x0000_t75" style="position:absolute;left:46757;width:21629;height:20828;visibility:visible;mso-wrap-style:square" o:gfxdata="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">
+                <v:shape id="Picture 5" o:spid="_x0000_s1029" type="#_x0000_t75" style="position:absolute;left:46757;width:21629;height:20828;visibility:visible;mso-wrap-style:square" o:gfxdata="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">
                   <v:imagedata r:id="rId15" o:title=""/>
                 </v:shape>
                 <v:shapetype id="_x0000_t202" coordsize="21600,21600" o:spt="202" path="m,l,21600r21600,l21600,xe">
                   <v:stroke joinstyle="miter"/>
                   <v:path gradientshapeok="t" o:connecttype="rect"/>
                 </v:shapetype>
-                <v:shape id="_x0000_s1030" type="#_x0000_t202" style="position:absolute;top:21451;width:21598;height:3321;visibility:visible;mso-wrap-style:square;v-text-anchor:top" o:gfxdata="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" filled="f" strokecolor="white [3212]">
+                <v:shape id="_x0000_s1030" type="#_x0000_t202" style="position:absolute;top:21451;width:21598;height:3321;visibility:visible;mso-wrap-style:square;v-text-anchor:top" o:gfxdata="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" filled="f" strokecolor="white [3212]">
                   <v:stroke joinstyle="round"/>
                   <v:textbox>
                     <w:txbxContent>
@@ -6145,7 +6334,7 @@
                     </w:txbxContent>
                   </v:textbox>
                 </v:shape>
-                <v:shape id="_x0000_s1031" type="#_x0000_t202" style="position:absolute;left:23576;top:21451;width:21663;height:3321;visibility:visible;mso-wrap-style:square;v-text-anchor:top" o:gfxdata="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" filled="f" strokecolor="white [3212]">
+                <v:shape id="_x0000_s1031" type="#_x0000_t202" style="position:absolute;left:23576;top:21451;width:21663;height:3321;visibility:visible;mso-wrap-style:square;v-text-anchor:top" o:gfxdata="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" filled="f" strokecolor="white [3212]">
                   <v:stroke joinstyle="round"/>
                   <v:textbox>
                     <w:txbxContent>
@@ -6166,7 +6355,7 @@
                     </w:txbxContent>
                   </v:textbox>
                 </v:shape>
-                <v:shape id="_x0000_s1032" type="#_x0000_t202" style="position:absolute;left:46807;top:21401;width:21663;height:3321;visibility:visible;mso-wrap-style:square;v-text-anchor:top" o:gfxdata="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" filled="f" strokecolor="white [3212]">
+                <v:shape id="_x0000_s1032" type="#_x0000_t202" style="position:absolute;left:46807;top:21401;width:21663;height:3321;visibility:visible;mso-wrap-style:square;v-text-anchor:top" o:gfxdata="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" filled="f" strokecolor="white [3212]">
                   <v:stroke joinstyle="round"/>
                   <v:textbox>
                     <w:txbxContent>
@@ -6209,6 +6398,7 @@
         <w:rPr>
           <w:noProof/>
         </w:rPr>
+        <w:lastRenderedPageBreak/>
         <mc:AlternateContent>
           <mc:Choice Requires="wps">
             <w:drawing>
@@ -6309,7 +6499,7 @@
           </mc:Choice>
           <mc:Fallback>
             <w:pict>
-              <v:shape w14:anchorId="137D975D" id="Text Box 6" o:spid="_x0000_s1033" type="#_x0000_t202" style="position:absolute;margin-left:300.3pt;margin-top:226.85pt;width:204.15pt;height:25.4pt;z-index:251664384;visibility:visible;mso-wrap-style:square;mso-width-percent:0;mso-wrap-distance-left:9pt;mso-wrap-distance-top:0;mso-wrap-distance-right:9pt;mso-wrap-distance-bottom:0;mso-position-horizontal:absolute;mso-position-horizontal-relative:text;mso-position-vertical:absolute;mso-position-vertical-relative:text;mso-width-percent:0;mso-width-relative:margin;v-text-anchor:top" o:gfxdata="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" filled="f" strokecolor="white [3212]">
+              <v:shape w14:anchorId="137D975D" id="Text Box 6" o:spid="_x0000_s1033" type="#_x0000_t202" style="position:absolute;margin-left:300.3pt;margin-top:226.85pt;width:204.15pt;height:25.4pt;z-index:251664384;visibility:visible;mso-wrap-style:square;mso-width-percent:0;mso-wrap-distance-left:9pt;mso-wrap-distance-top:0;mso-wrap-distance-right:9pt;mso-wrap-distance-bottom:0;mso-position-horizontal:absolute;mso-position-horizontal-relative:text;mso-position-vertical:absolute;mso-position-vertical-relative:text;mso-width-percent:0;mso-width-relative:margin;v-text-anchor:top" o:gfxdata="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" filled="f" strokecolor="white [3212]">
                 <v:stroke joinstyle="round"/>
                 <v:textbox>
                   <w:txbxContent>
@@ -6533,7 +6723,7 @@
           </mc:Choice>
           <mc:Fallback>
             <w:pict>
-              <v:shape w14:anchorId="5F62D8AD" id="_x0000_s1034" type="#_x0000_t202" style="position:absolute;margin-left:3.15pt;margin-top:228.2pt;width:204.15pt;height:25.4pt;z-index:251662336;visibility:visible;mso-wrap-style:square;mso-width-percent:0;mso-wrap-distance-left:9pt;mso-wrap-distance-top:0;mso-wrap-distance-right:9pt;mso-wrap-distance-bottom:0;mso-position-horizontal:absolute;mso-position-horizontal-relative:text;mso-position-vertical:absolute;mso-position-vertical-relative:text;mso-width-percent:0;mso-width-relative:margin;v-text-anchor:top" o:gfxdata="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" filled="f" strokecolor="white [3212]">
+              <v:shape w14:anchorId="5F62D8AD" id="_x0000_s1034" type="#_x0000_t202" style="position:absolute;margin-left:3.15pt;margin-top:228.2pt;width:204.15pt;height:25.4pt;z-index:251662336;visibility:visible;mso-wrap-style:square;mso-width-percent:0;mso-wrap-distance-left:9pt;mso-wrap-distance-top:0;mso-wrap-distance-right:9pt;mso-wrap-distance-bottom:0;mso-position-horizontal:absolute;mso-position-horizontal-relative:text;mso-position-vertical:absolute;mso-position-vertical-relative:text;mso-width-percent:0;mso-width-relative:margin;v-text-anchor:top" o:gfxdata="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" filled="f" strokecolor="white [3212]">
                 <v:stroke joinstyle="round"/>
                 <v:textbox>
                   <w:txbxContent>
@@ -6878,7 +7068,6 @@
           <w:sz w:val="24"/>
           <w:szCs w:val="24"/>
         </w:rPr>
-        <w:lastRenderedPageBreak/>
         <w:drawing>
           <wp:anchor distT="0" distB="0" distL="114300" distR="114300" simplePos="0" relativeHeight="251666432" behindDoc="0" locked="0" layoutInCell="1" allowOverlap="1" wp14:anchorId="283613DE" wp14:editId="4BED6543">
             <wp:simplePos x="0" y="0"/>
@@ -7130,7 +7319,7 @@
           </mc:Choice>
           <mc:Fallback>
             <w:pict>
-              <v:shape w14:anchorId="2D624747" id="_x0000_s1035" type="#_x0000_t202" style="position:absolute;margin-left:301.35pt;margin-top:185.35pt;width:204.15pt;height:25.4pt;z-index:251670528;visibility:visible;mso-wrap-style:square;mso-width-percent:0;mso-wrap-distance-left:9pt;mso-wrap-distance-top:0;mso-wrap-distance-right:9pt;mso-wrap-distance-bottom:0;mso-position-horizontal:absolute;mso-position-horizontal-relative:text;mso-position-vertical:absolute;mso-position-vertical-relative:text;mso-width-percent:0;mso-width-relative:margin;v-text-anchor:top" o:gfxdata="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" filled="f" strokecolor="white [3212]">
+              <v:shape w14:anchorId="2D624747" id="_x0000_s1035" type="#_x0000_t202" style="position:absolute;margin-left:301.35pt;margin-top:185.35pt;width:204.15pt;height:25.4pt;z-index:251670528;visibility:visible;mso-wrap-style:square;mso-width-percent:0;mso-wrap-distance-left:9pt;mso-wrap-distance-top:0;mso-wrap-distance-right:9pt;mso-wrap-distance-bottom:0;mso-position-horizontal:absolute;mso-position-horizontal-relative:text;mso-position-vertical:absolute;mso-position-vertical-relative:text;mso-width-percent:0;mso-width-relative:margin;v-text-anchor:top" o:gfxdata="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" filled="f" strokecolor="white [3212]">
                 <v:stroke joinstyle="round"/>
                 <v:textbox>
                   <w:txbxContent>
@@ -7259,7 +7448,7 @@
           </mc:Choice>
           <mc:Fallback>
             <w:pict>
-              <v:shape w14:anchorId="4963EE9C" id="_x0000_s1036" type="#_x0000_t202" style="position:absolute;margin-left:2.15pt;margin-top:186.75pt;width:204.15pt;height:25.4pt;z-index:251668480;visibility:visible;mso-wrap-style:square;mso-width-percent:0;mso-wrap-distance-left:9pt;mso-wrap-distance-top:0;mso-wrap-distance-right:9pt;mso-wrap-distance-bottom:0;mso-position-horizontal:absolute;mso-position-horizontal-relative:text;mso-position-vertical:absolute;mso-position-vertical-relative:text;mso-width-percent:0;mso-width-relative:margin;v-text-anchor:top" o:gfxdata="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" filled="f" strokecolor="white [3212]">
+              <v:shape w14:anchorId="4963EE9C" id="_x0000_s1036" type="#_x0000_t202" style="position:absolute;margin-left:2.15pt;margin-top:186.75pt;width:204.15pt;height:25.4pt;z-index:251668480;visibility:visible;mso-wrap-style:square;mso-width-percent:0;mso-wrap-distance-left:9pt;mso-wrap-distance-top:0;mso-wrap-distance-right:9pt;mso-wrap-distance-bottom:0;mso-position-horizontal:absolute;mso-position-horizontal-relative:text;mso-position-vertical:absolute;mso-position-vertical-relative:text;mso-width-percent:0;mso-width-relative:margin;v-text-anchor:top" o:gfxdata="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" filled="f" strokecolor="white [3212]">
                 <v:stroke joinstyle="round"/>
                 <v:textbox>
                   <w:txbxContent>
@@ -7400,7 +7589,7 @@
           </mc:Choice>
           <mc:Fallback>
             <w:pict>
-              <v:shape w14:anchorId="0304F911" id="_x0000_s1037" type="#_x0000_t202" style="position:absolute;margin-left:63pt;margin-top:260.6pt;width:204.15pt;height:25.4pt;z-index:251673600;visibility:visible;mso-wrap-style:square;mso-width-percent:0;mso-wrap-distance-left:9pt;mso-wrap-distance-top:0;mso-wrap-distance-right:9pt;mso-wrap-distance-bottom:0;mso-position-horizontal:absolute;mso-position-horizontal-relative:text;mso-position-vertical:absolute;mso-position-vertical-relative:text;mso-width-percent:0;mso-width-relative:margin;v-text-anchor:top" o:gfxdata="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" filled="f" strokecolor="white [3212]">
+              <v:shape w14:anchorId="0304F911" id="_x0000_s1037" type="#_x0000_t202" style="position:absolute;margin-left:63pt;margin-top:260.6pt;width:204.15pt;height:25.4pt;z-index:251673600;visibility:visible;mso-wrap-style:square;mso-width-percent:0;mso-wrap-distance-left:9pt;mso-wrap-distance-top:0;mso-wrap-distance-right:9pt;mso-wrap-distance-bottom:0;mso-position-horizontal:absolute;mso-position-horizontal-relative:text;mso-position-vertical:absolute;mso-position-vertical-relative:text;mso-width-percent:0;mso-width-relative:margin;v-text-anchor:top" o:gfxdata="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" filled="f" strokecolor="white [3212]">
                 <v:stroke joinstyle="round"/>
                 <v:textbox>
                   <w:txbxContent>
@@ -7610,7 +7799,7 @@
 </file>
 
 <file path=word/endnotes.xml><?xml version="1.0" encoding="utf-8"?>
-<w:endnotes xmlns:wpc="http://schemas.microsoft.com/office/word/2010/wordprocessingCanvas" xmlns:cx="http://schemas.microsoft.com/office/drawing/2014/chartex" xmlns:cx1="http://schemas.microsoft.com/office/drawing/2015/9/8/chartex" xmlns:cx2="http://schemas.microsoft.com/office/drawing/2015/10/21/chartex" xmlns:cx3="http://schemas.microsoft.com/office/drawing/2016/5/9/chartex" xmlns:cx4="http://schemas.microsoft.com/office/drawing/2016/5/10/chartex" xmlns:cx5="http://schemas.microsoft.com/office/drawing/2016/5/11/chartex" xmlns:cx6="http://schemas.microsoft.com/office/drawing/2016/5/12/chartex" xmlns:cx7="http://schemas.microsoft.com/office/drawing/2016/5/13/chartex" xmlns:cx8="http://schemas.microsoft.com/office/drawing/2016/5/14/chartex" xmlns:mc="http://schemas.openxmlformats.org/markup-compatibility/2006" xmlns:aink="http://schemas.microsoft.com/office/drawing/2016/ink" xmlns:am3d="http://schemas.microsoft.com/office/drawing/2017/model3d" xmlns:o="urn:schemas-microsoft-com:office:office" xmlns:oel="http://schemas.microsoft.com/office/2019/extlst" xmlns:r="http://schemas.openxmlformats.org/officeDocument/2006/relationships" xmlns:m="http://schemas.openxmlformats.org/officeDocument/2006/math" xmlns:v="urn:schemas-microsoft-com:vml" xmlns:wp14="http://schemas.microsoft.com/office/word/2010/wordprocessingDrawing" xmlns:wp="http://schemas.openxmlformats.org/drawingml/2006/wordprocessingDrawing" xmlns:w10="urn:schemas-microsoft-com:office:word" xmlns:w="http://schemas.openxmlformats.org/wordprocessingml/2006/main" xmlns:w14="http://schemas.microsoft.com/office/word/2010/wordml" xmlns:w15="http://schemas.microsoft.com/office/word/2012/wordml" xmlns:w16cex="http://schemas.microsoft.com/office/word/2018/wordml/cex" xmlns:w16cid="http://schemas.microsoft.com/office/word/2016/wordml/cid" xmlns:w16="http://schemas.microsoft.com/office/word/2018/wordml" xmlns:w16du="http://schemas.microsoft.com/office/word/2023/wordml/word16du" xmlns:w16sdtdh="http://schemas.microsoft.com/office/word/2020/wordml/sdtdatahash" xmlns:w16sdtfl="http://schemas.microsoft.com/office/word/2024/wordml/sdtformatlock" xmlns:w16se="http://schemas.microsoft.com/office/word/2015/wordml/symex" xmlns:wpg="http://schemas.microsoft.com/office/word/2010/wordprocessingGroup" xmlns:wpi="http://schemas.microsoft.com/office/word/2010/wordprocessingInk" xmlns:wne="http://schemas.microsoft.com/office/word/2006/wordml" xmlns:wps="http://schemas.microsoft.com/office/word/2010/wordprocessingShape" mc:Ignorable="w14 w15 w16se w16cid w16 w16cex w16sdtdh w16sdtfl w16du wp14">
+<w:endnotes xmlns:wpc="http://schemas.microsoft.com/office/word/2010/wordprocessingCanvas" xmlns:cx="http://schemas.microsoft.com/office/drawing/2014/chartex" xmlns:cx1="http://schemas.microsoft.com/office/drawing/2015/9/8/chartex" xmlns:cx2="http://schemas.microsoft.com/office/drawing/2015/10/21/chartex" xmlns:cx3="http://schemas.microsoft.com/office/drawing/2016/5/9/chartex" xmlns:cx4="http://schemas.microsoft.com/office/drawing/2016/5/10/chartex" xmlns:cx5="http://schemas.microsoft.com/office/drawing/2016/5/11/chartex" xmlns:cx6="http://schemas.microsoft.com/office/drawing/2016/5/12/chartex" xmlns:cx7="http://schemas.microsoft.com/office/drawing/2016/5/13/chartex" xmlns:cx8="http://schemas.microsoft.com/office/drawing/2016/5/14/chartex" xmlns:mc="http://schemas.openxmlformats.org/markup-compatibility/2006" xmlns:m="http://schemas.openxmlformats.org/officeDocument/2006/math" xmlns:aink="http://schemas.microsoft.com/office/drawing/2016/ink" xmlns:am3d="http://schemas.microsoft.com/office/drawing/2017/model3d" xmlns:oel="http://schemas.microsoft.com/office/2019/extlst" xmlns:r="http://schemas.openxmlformats.org/officeDocument/2006/relationships" xmlns:wp14="http://schemas.microsoft.com/office/word/2010/wordprocessingDrawing" xmlns:wp="http://schemas.openxmlformats.org/drawingml/2006/wordprocessingDrawing" xmlns:wpg="http://schemas.microsoft.com/office/word/2010/wordprocessingGroup" xmlns:wpi="http://schemas.microsoft.com/office/word/2010/wordprocessingInk" xmlns:wps="http://schemas.microsoft.com/office/word/2010/wordprocessingShape" xmlns:o="urn:schemas-microsoft-com:office:office" xmlns:v="urn:schemas-microsoft-com:vml" xmlns:w10="urn:schemas-microsoft-com:office:word" xmlns:w="http://schemas.openxmlformats.org/wordprocessingml/2006/main" xmlns:w14="http://schemas.microsoft.com/office/word/2010/wordml" xmlns:w15="http://schemas.microsoft.com/office/word/2012/wordml" xmlns:w16cex="http://schemas.microsoft.com/office/word/2018/wordml/cex" xmlns:w16cid="http://schemas.microsoft.com/office/word/2016/wordml/cid" xmlns:w16="http://schemas.microsoft.com/office/word/2018/wordml" xmlns:w16sdtdh="http://schemas.microsoft.com/office/word/2020/wordml/sdtdatahash" xmlns:w16sdtfl="http://schemas.microsoft.com/office/word/2024/wordml/sdtformatlock" xmlns:w16se="http://schemas.microsoft.com/office/word/2015/wordml/symex" xmlns:w16du="http://schemas.microsoft.com/office/word/2023/wordml/word16du" xmlns:wne="http://schemas.microsoft.com/office/word/2006/wordml" mc:Ignorable="w14 w15 w16se w16cid w16 w16cex w16sdtdh w16sdtfl w16du wp14">
   <w:endnote w:type="separator" w:id="-1">
     <w:p>
       <w:pPr>
@@ -7635,7 +7824,7 @@
 </file>
 
 <file path=word/footnotes.xml><?xml version="1.0" encoding="utf-8"?>
-<w:footnotes xmlns:wpc="http://schemas.microsoft.com/office/word/2010/wordprocessingCanvas" xmlns:cx="http://schemas.microsoft.com/office/drawing/2014/chartex" xmlns:cx1="http://schemas.microsoft.com/office/drawing/2015/9/8/chartex" xmlns:cx2="http://schemas.microsoft.com/office/drawing/2015/10/21/chartex" xmlns:cx3="http://schemas.microsoft.com/office/drawing/2016/5/9/chartex" xmlns:cx4="http://schemas.microsoft.com/office/drawing/2016/5/10/chartex" xmlns:cx5="http://schemas.microsoft.com/office/drawing/2016/5/11/chartex" xmlns:cx6="http://schemas.microsoft.com/office/drawing/2016/5/12/chartex" xmlns:cx7="http://schemas.microsoft.com/office/drawing/2016/5/13/chartex" xmlns:cx8="http://schemas.microsoft.com/office/drawing/2016/5/14/chartex" xmlns:mc="http://schemas.openxmlformats.org/markup-compatibility/2006" xmlns:aink="http://schemas.microsoft.com/office/drawing/2016/ink" xmlns:am3d="http://schemas.microsoft.com/office/drawing/2017/model3d" xmlns:o="urn:schemas-microsoft-com:office:office" xmlns:oel="http://schemas.microsoft.com/office/2019/extlst" xmlns:r="http://schemas.openxmlformats.org/officeDocument/2006/relationships" xmlns:m="http://schemas.openxmlformats.org/officeDocument/2006/math" xmlns:v="urn:schemas-microsoft-com:vml" xmlns:wp14="http://schemas.microsoft.com/office/word/2010/wordprocessingDrawing" xmlns:wp="http://schemas.openxmlformats.org/drawingml/2006/wordprocessingDrawing" xmlns:w10="urn:schemas-microsoft-com:office:word" xmlns:w="http://schemas.openxmlformats.org/wordprocessingml/2006/main" xmlns:w14="http://schemas.microsoft.com/office/word/2010/wordml" xmlns:w15="http://schemas.microsoft.com/office/word/2012/wordml" xmlns:w16cex="http://schemas.microsoft.com/office/word/2018/wordml/cex" xmlns:w16cid="http://schemas.microsoft.com/office/word/2016/wordml/cid" xmlns:w16="http://schemas.microsoft.com/office/word/2018/wordml" xmlns:w16du="http://schemas.microsoft.com/office/word/2023/wordml/word16du" xmlns:w16sdtdh="http://schemas.microsoft.com/office/word/2020/wordml/sdtdatahash" xmlns:w16sdtfl="http://schemas.microsoft.com/office/word/2024/wordml/sdtformatlock" xmlns:w16se="http://schemas.microsoft.com/office/word/2015/wordml/symex" xmlns:wpg="http://schemas.microsoft.com/office/word/2010/wordprocessingGroup" xmlns:wpi="http://schemas.microsoft.com/office/word/2010/wordprocessingInk" xmlns:wne="http://schemas.microsoft.com/office/word/2006/wordml" xmlns:wps="http://schemas.microsoft.com/office/word/2010/wordprocessingShape" mc:Ignorable="w14 w15 w16se w16cid w16 w16cex w16sdtdh w16sdtfl w16du wp14">
+<w:footnotes xmlns:wpc="http://schemas.microsoft.com/office/word/2010/wordprocessingCanvas" xmlns:cx="http://schemas.microsoft.com/office/drawing/2014/chartex" xmlns:cx1="http://schemas.microsoft.com/office/drawing/2015/9/8/chartex" xmlns:cx2="http://schemas.microsoft.com/office/drawing/2015/10/21/chartex" xmlns:cx3="http://schemas.microsoft.com/office/drawing/2016/5/9/chartex" xmlns:cx4="http://schemas.microsoft.com/office/drawing/2016/5/10/chartex" xmlns:cx5="http://schemas.microsoft.com/office/drawing/2016/5/11/chartex" xmlns:cx6="http://schemas.microsoft.com/office/drawing/2016/5/12/chartex" xmlns:cx7="http://schemas.microsoft.com/office/drawing/2016/5/13/chartex" xmlns:cx8="http://schemas.microsoft.com/office/drawing/2016/5/14/chartex" xmlns:mc="http://schemas.openxmlformats.org/markup-compatibility/2006" xmlns:m="http://schemas.openxmlformats.org/officeDocument/2006/math" xmlns:aink="http://schemas.microsoft.com/office/drawing/2016/ink" xmlns:am3d="http://schemas.microsoft.com/office/drawing/2017/model3d" xmlns:oel="http://schemas.microsoft.com/office/2019/extlst" xmlns:r="http://schemas.openxmlformats.org/officeDocument/2006/relationships" xmlns:wp14="http://schemas.microsoft.com/office/word/2010/wordprocessingDrawing" xmlns:wp="http://schemas.openxmlformats.org/drawingml/2006/wordprocessingDrawing" xmlns:wpg="http://schemas.microsoft.com/office/word/2010/wordprocessingGroup" xmlns:wpi="http://schemas.microsoft.com/office/word/2010/wordprocessingInk" xmlns:wps="http://schemas.microsoft.com/office/word/2010/wordprocessingShape" xmlns:o="urn:schemas-microsoft-com:office:office" xmlns:v="urn:schemas-microsoft-com:vml" xmlns:w10="urn:schemas-microsoft-com:office:word" xmlns:w="http://schemas.openxmlformats.org/wordprocessingml/2006/main" xmlns:w14="http://schemas.microsoft.com/office/word/2010/wordml" xmlns:w15="http://schemas.microsoft.com/office/word/2012/wordml" xmlns:w16cex="http://schemas.microsoft.com/office/word/2018/wordml/cex" xmlns:w16cid="http://schemas.microsoft.com/office/word/2016/wordml/cid" xmlns:w16="http://schemas.microsoft.com/office/word/2018/wordml" xmlns:w16sdtdh="http://schemas.microsoft.com/office/word/2020/wordml/sdtdatahash" xmlns:w16sdtfl="http://schemas.microsoft.com/office/word/2024/wordml/sdtformatlock" xmlns:w16se="http://schemas.microsoft.com/office/word/2015/wordml/symex" xmlns:w16du="http://schemas.microsoft.com/office/word/2023/wordml/word16du" xmlns:wne="http://schemas.microsoft.com/office/word/2006/wordml" mc:Ignorable="w14 w15 w16se w16cid w16 w16cex w16sdtdh w16sdtfl w16du wp14">
   <w:footnote w:type="separator" w:id="-1">
     <w:p>
       <w:pPr>
@@ -7660,7 +7849,7 @@
 </file>
 
 <file path=word/numbering.xml><?xml version="1.0" encoding="utf-8"?>
-<w:numbering xmlns:wpc="http://schemas.microsoft.com/office/word/2010/wordprocessingCanvas" xmlns:cx="http://schemas.microsoft.com/office/drawing/2014/chartex" xmlns:cx1="http://schemas.microsoft.com/office/drawing/2015/9/8/chartex" xmlns:cx2="http://schemas.microsoft.com/office/drawing/2015/10/21/chartex" xmlns:cx3="http://schemas.microsoft.com/office/drawing/2016/5/9/chartex" xmlns:cx4="http://schemas.microsoft.com/office/drawing/2016/5/10/chartex" xmlns:cx5="http://schemas.microsoft.com/office/drawing/2016/5/11/chartex" xmlns:cx6="http://schemas.microsoft.com/office/drawing/2016/5/12/chartex" xmlns:cx7="http://schemas.microsoft.com/office/drawing/2016/5/13/chartex" xmlns:cx8="http://schemas.microsoft.com/office/drawing/2016/5/14/chartex" xmlns:mc="http://schemas.openxmlformats.org/markup-compatibility/2006" xmlns:aink="http://schemas.microsoft.com/office/drawing/2016/ink" xmlns:am3d="http://schemas.microsoft.com/office/drawing/2017/model3d" xmlns:o="urn:schemas-microsoft-com:office:office" xmlns:oel="http://schemas.microsoft.com/office/2019/extlst" xmlns:r="http://schemas.openxmlformats.org/officeDocument/2006/relationships" xmlns:m="http://schemas.openxmlformats.org/officeDocument/2006/math" xmlns:v="urn:schemas-microsoft-com:vml" xmlns:wp14="http://schemas.microsoft.com/office/word/2010/wordprocessingDrawing" xmlns:wp="http://schemas.openxmlformats.org/drawingml/2006/wordprocessingDrawing" xmlns:w10="urn:schemas-microsoft-com:office:word" xmlns:w="http://schemas.openxmlformats.org/wordprocessingml/2006/main" xmlns:w14="http://schemas.microsoft.com/office/word/2010/wordml" xmlns:w15="http://schemas.microsoft.com/office/word/2012/wordml" xmlns:w16cex="http://schemas.microsoft.com/office/word/2018/wordml/cex" xmlns:w16cid="http://schemas.microsoft.com/office/word/2016/wordml/cid" xmlns:w16="http://schemas.microsoft.com/office/word/2018/wordml" xmlns:w16du="http://schemas.microsoft.com/office/word/2023/wordml/word16du" xmlns:w16sdtdh="http://schemas.microsoft.com/office/word/2020/wordml/sdtdatahash" xmlns:w16sdtfl="http://schemas.microsoft.com/office/word/2024/wordml/sdtformatlock" xmlns:w16se="http://schemas.microsoft.com/office/word/2015/wordml/symex" xmlns:wpg="http://schemas.microsoft.com/office/word/2010/wordprocessingGroup" xmlns:wpi="http://schemas.microsoft.com/office/word/2010/wordprocessingInk" xmlns:wne="http://schemas.microsoft.com/office/word/2006/wordml" xmlns:wps="http://schemas.microsoft.com/office/word/2010/wordprocessingShape" mc:Ignorable="w14 w15 w16se w16cid w16 w16cex w16sdtdh w16sdtfl w16du wp14">
+<w:numbering xmlns:wpc="http://schemas.microsoft.com/office/word/2010/wordprocessingCanvas" xmlns:cx="http://schemas.microsoft.com/office/drawing/2014/chartex" xmlns:cx1="http://schemas.microsoft.com/office/drawing/2015/9/8/chartex" xmlns:cx2="http://schemas.microsoft.com/office/drawing/2015/10/21/chartex" xmlns:cx3="http://schemas.microsoft.com/office/drawing/2016/5/9/chartex" xmlns:cx4="http://schemas.microsoft.com/office/drawing/2016/5/10/chartex" xmlns:cx5="http://schemas.microsoft.com/office/drawing/2016/5/11/chartex" xmlns:cx6="http://schemas.microsoft.com/office/drawing/2016/5/12/chartex" xmlns:cx7="http://schemas.microsoft.com/office/drawing/2016/5/13/chartex" xmlns:cx8="http://schemas.microsoft.com/office/drawing/2016/5/14/chartex" xmlns:mc="http://schemas.openxmlformats.org/markup-compatibility/2006" xmlns:m="http://schemas.openxmlformats.org/officeDocument/2006/math" xmlns:aink="http://schemas.microsoft.com/office/drawing/2016/ink" xmlns:am3d="http://schemas.microsoft.com/office/drawing/2017/model3d" xmlns:oel="http://schemas.microsoft.com/office/2019/extlst" xmlns:r="http://schemas.openxmlformats.org/officeDocument/2006/relationships" xmlns:wp14="http://schemas.microsoft.com/office/word/2010/wordprocessingDrawing" xmlns:wp="http://schemas.openxmlformats.org/drawingml/2006/wordprocessingDrawing" xmlns:wpg="http://schemas.microsoft.com/office/word/2010/wordprocessingGroup" xmlns:wpi="http://schemas.microsoft.com/office/word/2010/wordprocessingInk" xmlns:wps="http://schemas.microsoft.com/office/word/2010/wordprocessingShape" xmlns:o="urn:schemas-microsoft-com:office:office" xmlns:v="urn:schemas-microsoft-com:vml" xmlns:w10="urn:schemas-microsoft-com:office:word" xmlns:w="http://schemas.openxmlformats.org/wordprocessingml/2006/main" xmlns:w14="http://schemas.microsoft.com/office/word/2010/wordml" xmlns:w15="http://schemas.microsoft.com/office/word/2012/wordml" xmlns:w16cex="http://schemas.microsoft.com/office/word/2018/wordml/cex" xmlns:w16cid="http://schemas.microsoft.com/office/word/2016/wordml/cid" xmlns:w16="http://schemas.microsoft.com/office/word/2018/wordml" xmlns:w16sdtdh="http://schemas.microsoft.com/office/word/2020/wordml/sdtdatahash" xmlns:w16sdtfl="http://schemas.microsoft.com/office/word/2024/wordml/sdtformatlock" xmlns:w16se="http://schemas.microsoft.com/office/word/2015/wordml/symex" xmlns:w16du="http://schemas.microsoft.com/office/word/2023/wordml/word16du" xmlns:wne="http://schemas.microsoft.com/office/word/2006/wordml" mc:Ignorable="w14 w15 w16se w16cid w16 w16cex w16sdtdh w16sdtfl w16du wp14">
   <w:abstractNum w:abstractNumId="0" w15:restartNumberingAfterBreak="0">
     <w:nsid w:val="4F0D7E92"/>
     <w:multiLevelType w:val="hybridMultilevel"/>
@@ -7781,7 +7970,7 @@
 </file>
 
 <file path=word/styles.xml><?xml version="1.0" encoding="utf-8"?>
-<w:styles xmlns:mc="http://schemas.openxmlformats.org/markup-compatibility/2006" xmlns:r="http://schemas.openxmlformats.org/officeDocument/2006/relationships" xmlns:w="http://schemas.openxmlformats.org/wordprocessingml/2006/main" xmlns:w14="http://schemas.microsoft.com/office/word/2010/wordml" xmlns:w15="http://schemas.microsoft.com/office/word/2012/wordml" xmlns:w16cex="http://schemas.microsoft.com/office/word/2018/wordml/cex" xmlns:w16cid="http://schemas.microsoft.com/office/word/2016/wordml/cid" xmlns:w16="http://schemas.microsoft.com/office/word/2018/wordml" xmlns:w16du="http://schemas.microsoft.com/office/word/2023/wordml/word16du" xmlns:w16sdtdh="http://schemas.microsoft.com/office/word/2020/wordml/sdtdatahash" xmlns:w16sdtfl="http://schemas.microsoft.com/office/word/2024/wordml/sdtformatlock" xmlns:w16se="http://schemas.microsoft.com/office/word/2015/wordml/symex" mc:Ignorable="w14 w15 w16se w16cid w16 w16cex w16sdtdh w16sdtfl w16du">
+<w:styles xmlns:mc="http://schemas.openxmlformats.org/markup-compatibility/2006" xmlns:r="http://schemas.openxmlformats.org/officeDocument/2006/relationships" xmlns:w="http://schemas.openxmlformats.org/wordprocessingml/2006/main" xmlns:w14="http://schemas.microsoft.com/office/word/2010/wordml" xmlns:w15="http://schemas.microsoft.com/office/word/2012/wordml" xmlns:w16cex="http://schemas.microsoft.com/office/word/2018/wordml/cex" xmlns:w16cid="http://schemas.microsoft.com/office/word/2016/wordml/cid" xmlns:w16="http://schemas.microsoft.com/office/word/2018/wordml" xmlns:w16sdtdh="http://schemas.microsoft.com/office/word/2020/wordml/sdtdatahash" xmlns:w16sdtfl="http://schemas.microsoft.com/office/word/2024/wordml/sdtformatlock" xmlns:w16se="http://schemas.microsoft.com/office/word/2015/wordml/symex" xmlns:w16du="http://schemas.microsoft.com/office/word/2023/wordml/word16du" mc:Ignorable="w14 w15 w16se w16cid w16 w16cex w16sdtdh w16sdtfl w16du">
   <w:docDefaults>
     <w:rPrDefault>
       <w:rPr>
@@ -8272,6 +8461,30 @@
     <w:uiPriority w:val="99"/>
     <w:rsid w:val="006B5539"/>
   </w:style>
+  <w:style w:type="paragraph" w:styleId="NormalWeb">
+    <w:name w:val="Normal (Web)"/>
+    <w:basedOn w:val="Normal"/>
+    <w:uiPriority w:val="99"/>
+    <w:semiHidden/>
+    <w:unhideWhenUsed/>
+    <w:rsid w:val="00C42D5B"/>
+    <w:pPr>
+      <w:spacing w:before="100" w:beforeAutospacing="1" w:after="100" w:afterAutospacing="1" w:line="240" w:lineRule="auto"/>
+    </w:pPr>
+    <w:rPr>
+      <w:rFonts w:ascii="Times New Roman" w:eastAsia="Times New Roman" w:hAnsi="Times New Roman" w:cs="Times New Roman"/>
+      <w:kern w:val="0"/>
+      <w:sz w:val="24"/>
+      <w:szCs w:val="24"/>
+      <w:lang w:eastAsia="en-GB"/>
+      <w14:ligatures w14:val="none"/>
+    </w:rPr>
+  </w:style>
+  <w:style w:type="character" w:customStyle="1" w:styleId="rynqvb">
+    <w:name w:val="rynqvb"/>
+    <w:basedOn w:val="DefaultParagraphFont"/>
+    <w:rsid w:val="005A2B6A"/>
+  </w:style>
 </w:styles>
 </file>
 

</xml_diff>